<commit_message>
fix(templates): the risk evaluation team decision sets each person's role off with commas
"X în calitate de …, începând", "X având funcția de … în cadrul … va
îndeplini" and "X în calitate de … din cadrul … va coordona" now read "X,
în calitate de …", "X, având funcția de … în cadrul …, va îndeplini" and
"X, în calitate de … din cadrul …, va coordona".

Claude-Session: https://claude.ai/code/session_01A9qjCHVH6kcDAEKFiJoShR
</commit_message>
<xml_diff>
--- a/packages/document-engine/templates/1.2_decision_risk_evaluation_team.docx
+++ b/packages/document-engine/templates/1.2_decision_risk_evaluation_team.docx
@@ -151,7 +151,7 @@
           <w:szCs w:val="20"/>
           <w:lang w:val="ro-RO"/>
         </w:rPr>
-        <w:t>, {{client.representativeName}}</w:t>
+        <w:t xml:space="preserve">, {{client.representativeName}},</w:t>
       </w:r>
       <w:r>
         <w:rPr>
@@ -329,7 +329,7 @@
           <w:szCs w:val="20"/>
           <w:lang w:val="ro-RO"/>
         </w:rPr>
-        <w:t>{{name}} având funcția de {{jobTitle}} în cadrul {{client.legalName}}</w:t>
+        <w:t xml:space="preserve">{{name}}, având funcția de {{jobTitle}} în cadrul {{client.legalName}},</w:t>
       </w:r>
       <w:r>
         <w:rPr>
@@ -399,7 +399,7 @@
           <w:szCs w:val="20"/>
           <w:lang w:val="ro-RO"/>
         </w:rPr>
-        <w:t>{{specialist.name}} în calitate de {{specialist.professionalTitle}} din cadrul {{provider.legalName}} va coordona activitatea echipei de evaluare a riscurilor de accidentare și îmbolnăvire profesională.</w:t>
+        <w:t xml:space="preserve">{{specialist.name}}, în calitate de {{specialist.professionalTitle}} din cadrul {{provider.legalName}}, va coordona activitatea echipei de evaluare a riscurilor de accidentare și îmbolnăvire profesională.</w:t>
       </w:r>
     </w:p>
     <w:p>

</xml_diff>